<commit_message>
Initial setup and work through ADR-003
</commit_message>
<xml_diff>
--- a/FHIR IG DevelopmentToolkit_Roadmap.docx
+++ b/FHIR IG DevelopmentToolkit_Roadmap.docx
@@ -4,52 +4,35 @@
   <w:body>
     <w:p>
       <w:pPr>
+        <w:pStyle w:val="Heading1"/>
+      </w:pPr>
+      <w:r>
+        <w:t>FHIR IG Analysis Toolkit</w:t>
+      </w:r>
+    </w:p>
+    <w:p>
+      <w:pPr>
+        <w:pStyle w:val="Heading2"/>
+      </w:pPr>
+      <w:r>
+        <w:t>Vision</w:t>
+      </w:r>
+    </w:p>
+    <w:p>
+      <w:pPr>
         <w:rPr>
           <w:b/>
           <w:bCs/>
         </w:rPr>
       </w:pPr>
       <w:r>
+        <w:t>A suite of tools that assist FHIR Implementation Guide authors and standards developers in understanding, authoring, validating, documenting, visualizing, maturing, and maintaining FHIR Implementation Guides throughout their lifecycle.</w:t>
+      </w:r>
+    </w:p>
+    <w:p>
+      <w:r>
         <w:rPr>
-          <w:b/>
-          <w:bCs/>
-        </w:rPr>
-        <w:t>FHIR IG Analysis Toolkit</w:t>
-      </w:r>
-    </w:p>
-    <w:p>
-      <w:pPr>
-        <w:rPr>
-          <w:b/>
-          <w:bCs/>
-        </w:rPr>
-      </w:pPr>
-      <w:r>
-        <w:rPr>
-          <w:b/>
-          <w:bCs/>
-        </w:rPr>
-        <w:t>Vision</w:t>
-      </w:r>
-    </w:p>
-    <w:p>
-      <w:r>
-        <w:t>A suite of tools that assist IG authors with understanding, validating, documenting, and maintaining FHIR Implementation Guides.</w:t>
-      </w:r>
-    </w:p>
-    <w:p>
-      <w:pPr>
-        <w:rPr>
-          <w:b/>
-          <w:bCs/>
-        </w:rPr>
-      </w:pPr>
-    </w:p>
-    <w:p>
-      <w:r>
-        <w:rPr>
-          <w:b/>
-          <w:bCs/>
+          <w:rStyle w:val="Heading2Char"/>
         </w:rPr>
         <w:t>Purpose</w:t>
       </w:r>
@@ -61,212 +44,503 @@
         <w:br/>
       </w:r>
       <w:r>
-        <w:t>The FHIR IG Development Toolkit is intended to provide</w:t>
-      </w:r>
-      <w:r>
-        <w:br/>
-        <w:t>a reusable suite of tools that assist Implementation Guide</w:t>
-      </w:r>
-      <w:r>
-        <w:br/>
-        <w:t>authors in understanding, validating, documenting,</w:t>
-      </w:r>
-      <w:r>
-        <w:br/>
-        <w:t xml:space="preserve">visualizing, </w:t>
-      </w:r>
-      <w:r>
-        <w:t xml:space="preserve">maturing, </w:t>
-      </w:r>
-      <w:r>
-        <w:t>and maintaining FHIR Implementation Guides.</w:t>
+        <w:t>A suite of tools that assist FHIR Implementation Guide authors and standards developers in understanding, authoring, validating, documenting, visualizing, maturing, and maintaining FHIR Implementation Guides throughout their lifecycle.</w:t>
+      </w:r>
+    </w:p>
+    <w:p>
+      <w:pPr>
+        <w:pStyle w:val="Heading2"/>
+      </w:pPr>
+      <w:r>
+        <w:t>Scope</w:t>
+      </w:r>
+    </w:p>
+    <w:p>
+      <w:r>
+        <w:t>The toolkit is intended to support the development and maintenance of FHIR Implementation Guides and related standards artifacts.</w:t>
+      </w:r>
+    </w:p>
+    <w:p>
+      <w:r>
+        <w:t>This includes tools that analyze, generate, validate, visualize, and document:</w:t>
+      </w:r>
+    </w:p>
+    <w:p>
+      <w:pPr>
+        <w:numPr>
+          <w:ilvl w:val="0"/>
+          <w:numId w:val="4"/>
+        </w:numPr>
+      </w:pPr>
+      <w:proofErr w:type="spellStart"/>
+      <w:r>
+        <w:t>ImplementationGuide</w:t>
+      </w:r>
+      <w:proofErr w:type="spellEnd"/>
+      <w:r>
+        <w:t xml:space="preserve"> resources </w:t>
+      </w:r>
+    </w:p>
+    <w:p>
+      <w:pPr>
+        <w:numPr>
+          <w:ilvl w:val="0"/>
+          <w:numId w:val="4"/>
+        </w:numPr>
+      </w:pPr>
+      <w:proofErr w:type="spellStart"/>
+      <w:r>
+        <w:t>StructureDefinitions</w:t>
+      </w:r>
+      <w:proofErr w:type="spellEnd"/>
+      <w:r>
+        <w:t xml:space="preserve"> (profiles, extensions, logical models) </w:t>
+      </w:r>
+    </w:p>
+    <w:p>
+      <w:pPr>
+        <w:numPr>
+          <w:ilvl w:val="0"/>
+          <w:numId w:val="4"/>
+        </w:numPr>
+      </w:pPr>
+      <w:r>
+        <w:t xml:space="preserve">ValueSets and </w:t>
+      </w:r>
+      <w:proofErr w:type="spellStart"/>
+      <w:r>
+        <w:t>CodeSystems</w:t>
+      </w:r>
+      <w:proofErr w:type="spellEnd"/>
+      <w:r>
+        <w:t xml:space="preserve"> </w:t>
+      </w:r>
+    </w:p>
+    <w:p>
+      <w:pPr>
+        <w:numPr>
+          <w:ilvl w:val="0"/>
+          <w:numId w:val="4"/>
+        </w:numPr>
+      </w:pPr>
+      <w:proofErr w:type="spellStart"/>
+      <w:r>
+        <w:t>ConceptMaps</w:t>
+      </w:r>
+      <w:proofErr w:type="spellEnd"/>
+      <w:r>
+        <w:t xml:space="preserve"> </w:t>
+      </w:r>
+    </w:p>
+    <w:p>
+      <w:pPr>
+        <w:numPr>
+          <w:ilvl w:val="0"/>
+          <w:numId w:val="4"/>
+        </w:numPr>
+      </w:pPr>
+      <w:proofErr w:type="spellStart"/>
+      <w:r>
+        <w:t>NamingSystems</w:t>
+      </w:r>
+      <w:proofErr w:type="spellEnd"/>
+      <w:r>
+        <w:t xml:space="preserve"> </w:t>
+      </w:r>
+    </w:p>
+    <w:p>
+      <w:pPr>
+        <w:numPr>
+          <w:ilvl w:val="0"/>
+          <w:numId w:val="4"/>
+        </w:numPr>
+      </w:pPr>
+      <w:proofErr w:type="spellStart"/>
+      <w:r>
+        <w:t>CapabilityStatements</w:t>
+      </w:r>
+      <w:proofErr w:type="spellEnd"/>
+      <w:r>
+        <w:t xml:space="preserve"> </w:t>
+      </w:r>
+    </w:p>
+    <w:p>
+      <w:pPr>
+        <w:numPr>
+          <w:ilvl w:val="0"/>
+          <w:numId w:val="4"/>
+        </w:numPr>
+      </w:pPr>
+      <w:proofErr w:type="spellStart"/>
+      <w:r>
+        <w:t>OperationDefinitions</w:t>
+      </w:r>
+      <w:proofErr w:type="spellEnd"/>
+      <w:r>
+        <w:t xml:space="preserve"> </w:t>
+      </w:r>
+    </w:p>
+    <w:p>
+      <w:pPr>
+        <w:numPr>
+          <w:ilvl w:val="0"/>
+          <w:numId w:val="4"/>
+        </w:numPr>
+      </w:pPr>
+      <w:proofErr w:type="spellStart"/>
+      <w:r>
+        <w:t>SearchParameters</w:t>
+      </w:r>
+      <w:proofErr w:type="spellEnd"/>
+      <w:r>
+        <w:t xml:space="preserve"> </w:t>
+      </w:r>
+    </w:p>
+    <w:p>
+      <w:pPr>
+        <w:numPr>
+          <w:ilvl w:val="0"/>
+          <w:numId w:val="4"/>
+        </w:numPr>
+      </w:pPr>
+      <w:proofErr w:type="spellStart"/>
+      <w:r>
+        <w:t>ExampleScenario</w:t>
+      </w:r>
+      <w:proofErr w:type="spellEnd"/>
+      <w:r>
+        <w:t xml:space="preserve"> resources </w:t>
+      </w:r>
+    </w:p>
+    <w:p>
+      <w:pPr>
+        <w:numPr>
+          <w:ilvl w:val="0"/>
+          <w:numId w:val="4"/>
+        </w:numPr>
+      </w:pPr>
+      <w:proofErr w:type="spellStart"/>
+      <w:r>
+        <w:t>ActorDefinition</w:t>
+      </w:r>
+      <w:proofErr w:type="spellEnd"/>
+      <w:r>
+        <w:t xml:space="preserve"> resources </w:t>
+      </w:r>
+    </w:p>
+    <w:p>
+      <w:pPr>
+        <w:numPr>
+          <w:ilvl w:val="0"/>
+          <w:numId w:val="4"/>
+        </w:numPr>
+      </w:pPr>
+      <w:r>
+        <w:t xml:space="preserve">Requirements resources </w:t>
+      </w:r>
+    </w:p>
+    <w:p>
+      <w:pPr>
+        <w:numPr>
+          <w:ilvl w:val="0"/>
+          <w:numId w:val="4"/>
+        </w:numPr>
+      </w:pPr>
+      <w:proofErr w:type="spellStart"/>
+      <w:r>
+        <w:t>TestPlan</w:t>
+      </w:r>
+      <w:proofErr w:type="spellEnd"/>
+      <w:r>
+        <w:t xml:space="preserve"> and </w:t>
+      </w:r>
+      <w:proofErr w:type="spellStart"/>
+      <w:r>
+        <w:t>TestScript</w:t>
+      </w:r>
+      <w:proofErr w:type="spellEnd"/>
+      <w:r>
+        <w:t xml:space="preserve"> resources </w:t>
+      </w:r>
+    </w:p>
+    <w:p>
+      <w:pPr>
+        <w:numPr>
+          <w:ilvl w:val="0"/>
+          <w:numId w:val="4"/>
+        </w:numPr>
+      </w:pPr>
+      <w:proofErr w:type="spellStart"/>
+      <w:r>
+        <w:t>SubscriptionTopic</w:t>
+      </w:r>
+      <w:proofErr w:type="spellEnd"/>
+      <w:r>
+        <w:t xml:space="preserve"> resources </w:t>
+      </w:r>
+    </w:p>
+    <w:p>
+      <w:pPr>
+        <w:numPr>
+          <w:ilvl w:val="0"/>
+          <w:numId w:val="4"/>
+        </w:numPr>
+      </w:pPr>
+      <w:proofErr w:type="spellStart"/>
+      <w:r>
+        <w:lastRenderedPageBreak/>
+        <w:t>GraphDefinition</w:t>
+      </w:r>
+      <w:proofErr w:type="spellEnd"/>
+      <w:r>
+        <w:t xml:space="preserve"> resources </w:t>
+      </w:r>
+    </w:p>
+    <w:p>
+      <w:pPr>
+        <w:numPr>
+          <w:ilvl w:val="0"/>
+          <w:numId w:val="4"/>
+        </w:numPr>
+      </w:pPr>
+      <w:proofErr w:type="spellStart"/>
+      <w:r>
+        <w:t>StructureMaps</w:t>
+      </w:r>
+      <w:proofErr w:type="spellEnd"/>
+      <w:r>
+        <w:t xml:space="preserve"> </w:t>
+      </w:r>
+    </w:p>
+    <w:p>
+      <w:pPr>
+        <w:numPr>
+          <w:ilvl w:val="0"/>
+          <w:numId w:val="4"/>
+        </w:numPr>
+      </w:pPr>
+      <w:r>
+        <w:t xml:space="preserve">Questionnaire and Library resources </w:t>
+      </w:r>
+    </w:p>
+    <w:p>
+      <w:pPr>
+        <w:numPr>
+          <w:ilvl w:val="0"/>
+          <w:numId w:val="4"/>
+        </w:numPr>
+      </w:pPr>
+      <w:r>
+        <w:t xml:space="preserve">Example resources used within implementation guides </w:t>
+      </w:r>
+    </w:p>
+    <w:p>
+      <w:r>
+        <w:t xml:space="preserve">The toolkit may also support artifacts external to FHIR resources—including FSH, Markdown documentation, </w:t>
+      </w:r>
+      <w:proofErr w:type="spellStart"/>
+      <w:r>
+        <w:t>PlantUML</w:t>
+      </w:r>
+      <w:proofErr w:type="spellEnd"/>
+      <w:r>
+        <w:t xml:space="preserve">, Mermaid, </w:t>
+      </w:r>
+      <w:proofErr w:type="spellStart"/>
+      <w:r>
+        <w:t>GraphViz</w:t>
+      </w:r>
+      <w:proofErr w:type="spellEnd"/>
+      <w:r>
+        <w:t>, spreadsheets, business process models, and other implementation assets—when they contribute to the specification, documentation, testing, or lifecycle management of an implementation guide.</w:t>
+      </w:r>
+    </w:p>
+    <w:p/>
+    <w:p>
+      <w:pPr>
+        <w:pStyle w:val="Heading2"/>
+      </w:pPr>
+      <w:r>
+        <w:t>Roadmap</w:t>
       </w:r>
     </w:p>
     <w:p>
       <w:r>
         <w:pict w14:anchorId="723A3F94">
-          <v:rect id="_x0000_i1035" style="width:0;height:1.5pt" o:hralign="center" o:hrstd="t" o:hr="t" fillcolor="#a0a0a0" stroked="f"/>
-        </w:pict>
-      </w:r>
-    </w:p>
-    <w:p>
-      <w:pPr>
-        <w:rPr>
-          <w:b/>
-          <w:bCs/>
-        </w:rPr>
-      </w:pPr>
-      <w:r>
-        <w:rPr>
-          <w:b/>
-          <w:bCs/>
-        </w:rPr>
-        <w:t>Phase 0 – Core Infrastructure</w:t>
-      </w:r>
-    </w:p>
-    <w:p>
-      <w:r>
-        <w:t>This contains the plumbing every capability will reuse.</w:t>
-      </w:r>
-    </w:p>
-    <w:p>
-      <w:r>
-        <w:t>Examples:</w:t>
-      </w:r>
-    </w:p>
-    <w:p>
-      <w:pPr>
-        <w:numPr>
-          <w:ilvl w:val="0"/>
-          <w:numId w:val="3"/>
-        </w:numPr>
-      </w:pPr>
-      <w:r>
-        <w:t xml:space="preserve">Package loader </w:t>
-      </w:r>
-    </w:p>
-    <w:p>
-      <w:pPr>
-        <w:numPr>
-          <w:ilvl w:val="0"/>
-          <w:numId w:val="3"/>
-        </w:numPr>
-      </w:pPr>
-      <w:r>
-        <w:t xml:space="preserve">IG loader </w:t>
-      </w:r>
-    </w:p>
-    <w:p>
-      <w:pPr>
-        <w:numPr>
-          <w:ilvl w:val="0"/>
-          <w:numId w:val="3"/>
-        </w:numPr>
-      </w:pPr>
-      <w:r>
-        <w:t xml:space="preserve">FSH loader </w:t>
-      </w:r>
-    </w:p>
-    <w:p>
-      <w:pPr>
-        <w:numPr>
-          <w:ilvl w:val="0"/>
-          <w:numId w:val="3"/>
-        </w:numPr>
-      </w:pPr>
-      <w:r>
-        <w:t xml:space="preserve">Resource indexing </w:t>
-      </w:r>
-    </w:p>
-    <w:p>
-      <w:pPr>
-        <w:numPr>
-          <w:ilvl w:val="0"/>
-          <w:numId w:val="3"/>
-        </w:numPr>
-      </w:pPr>
-      <w:r>
-        <w:t xml:space="preserve">Canonical resolution </w:t>
-      </w:r>
-    </w:p>
-    <w:p>
-      <w:pPr>
-        <w:numPr>
-          <w:ilvl w:val="0"/>
-          <w:numId w:val="3"/>
-        </w:numPr>
-      </w:pPr>
-      <w:proofErr w:type="spellStart"/>
-      <w:r>
-        <w:t>StructureDefinition</w:t>
-      </w:r>
-      <w:proofErr w:type="spellEnd"/>
-      <w:r>
-        <w:t xml:space="preserve"> cache </w:t>
-      </w:r>
-    </w:p>
-    <w:p>
-      <w:pPr>
-        <w:numPr>
-          <w:ilvl w:val="0"/>
-          <w:numId w:val="3"/>
-        </w:numPr>
-      </w:pPr>
-      <w:r>
-        <w:t xml:space="preserve">Terminology cache </w:t>
-      </w:r>
-    </w:p>
-    <w:p>
-      <w:pPr>
-        <w:numPr>
-          <w:ilvl w:val="0"/>
-          <w:numId w:val="3"/>
-        </w:numPr>
-      </w:pPr>
-      <w:r>
-        <w:t xml:space="preserve">Reference resolver </w:t>
-      </w:r>
-    </w:p>
-    <w:p>
-      <w:pPr>
-        <w:numPr>
-          <w:ilvl w:val="0"/>
-          <w:numId w:val="3"/>
-        </w:numPr>
-      </w:pPr>
-      <w:r>
-        <w:t xml:space="preserve">Common utilities </w:t>
-      </w:r>
-    </w:p>
-    <w:p>
-      <w:pPr>
-        <w:numPr>
-          <w:ilvl w:val="0"/>
-          <w:numId w:val="3"/>
-        </w:numPr>
-      </w:pPr>
-      <w:r>
-        <w:t xml:space="preserve">Configuration management </w:t>
-      </w:r>
-    </w:p>
-    <w:p>
-      <w:pPr>
-        <w:numPr>
-          <w:ilvl w:val="0"/>
-          <w:numId w:val="3"/>
-        </w:numPr>
-      </w:pPr>
-      <w:r>
-        <w:t xml:space="preserve">Plugin framework (eventually) </w:t>
-      </w:r>
-    </w:p>
-    <w:p>
-      <w:r>
-        <w:t>Without these, every later phase ends up duplicating code.</w:t>
-      </w:r>
-    </w:p>
-    <w:p/>
-    <w:p>
-      <w:r>
-        <w:lastRenderedPageBreak/>
-        <w:pict w14:anchorId="13D3C56C">
           <v:rect id="_x0000_i1025" style="width:0;height:1.5pt" o:hralign="center" o:hrstd="t" o:hr="t" fillcolor="#a0a0a0" stroked="f"/>
         </w:pict>
       </w:r>
     </w:p>
     <w:p>
       <w:pPr>
-        <w:rPr>
-          <w:b/>
-          <w:bCs/>
-        </w:rPr>
-      </w:pPr>
-      <w:r>
-        <w:rPr>
-          <w:b/>
-          <w:bCs/>
-        </w:rPr>
+        <w:pStyle w:val="Heading3"/>
+      </w:pPr>
+      <w:r>
+        <w:t>Phase 0 – Core Infrastructure</w:t>
+      </w:r>
+      <w:r>
+        <w:t xml:space="preserve"> – Build the Platform</w:t>
+      </w:r>
+    </w:p>
+    <w:p>
+      <w:r>
+        <w:t>This contains the plumbing every capability will reuse.</w:t>
+      </w:r>
+    </w:p>
+    <w:p>
+      <w:r>
+        <w:t>Examples:</w:t>
+      </w:r>
+    </w:p>
+    <w:p>
+      <w:pPr>
+        <w:numPr>
+          <w:ilvl w:val="0"/>
+          <w:numId w:val="3"/>
+        </w:numPr>
+      </w:pPr>
+      <w:r>
+        <w:t xml:space="preserve">Package loader </w:t>
+      </w:r>
+    </w:p>
+    <w:p>
+      <w:pPr>
+        <w:numPr>
+          <w:ilvl w:val="0"/>
+          <w:numId w:val="3"/>
+        </w:numPr>
+      </w:pPr>
+      <w:r>
+        <w:t xml:space="preserve">IG loader </w:t>
+      </w:r>
+    </w:p>
+    <w:p>
+      <w:pPr>
+        <w:numPr>
+          <w:ilvl w:val="0"/>
+          <w:numId w:val="3"/>
+        </w:numPr>
+      </w:pPr>
+      <w:r>
+        <w:t xml:space="preserve">FSH loader </w:t>
+      </w:r>
+    </w:p>
+    <w:p>
+      <w:pPr>
+        <w:numPr>
+          <w:ilvl w:val="0"/>
+          <w:numId w:val="3"/>
+        </w:numPr>
+      </w:pPr>
+      <w:r>
+        <w:t xml:space="preserve">Resource indexing </w:t>
+      </w:r>
+    </w:p>
+    <w:p>
+      <w:pPr>
+        <w:numPr>
+          <w:ilvl w:val="0"/>
+          <w:numId w:val="3"/>
+        </w:numPr>
+      </w:pPr>
+      <w:r>
+        <w:t xml:space="preserve">Canonical resolution </w:t>
+      </w:r>
+    </w:p>
+    <w:p>
+      <w:pPr>
+        <w:numPr>
+          <w:ilvl w:val="0"/>
+          <w:numId w:val="3"/>
+        </w:numPr>
+      </w:pPr>
+      <w:proofErr w:type="spellStart"/>
+      <w:r>
+        <w:t>StructureDefinition</w:t>
+      </w:r>
+      <w:proofErr w:type="spellEnd"/>
+      <w:r>
+        <w:t xml:space="preserve"> cache </w:t>
+      </w:r>
+    </w:p>
+    <w:p>
+      <w:pPr>
+        <w:numPr>
+          <w:ilvl w:val="0"/>
+          <w:numId w:val="3"/>
+        </w:numPr>
+      </w:pPr>
+      <w:r>
+        <w:t xml:space="preserve">Terminology cache </w:t>
+      </w:r>
+    </w:p>
+    <w:p>
+      <w:pPr>
+        <w:numPr>
+          <w:ilvl w:val="0"/>
+          <w:numId w:val="3"/>
+        </w:numPr>
+      </w:pPr>
+      <w:r>
+        <w:t>Relationship Discovery Engine (Formerly Reference resolver then Relationship extractor)</w:t>
+      </w:r>
+    </w:p>
+    <w:p>
+      <w:pPr>
+        <w:numPr>
+          <w:ilvl w:val="0"/>
+          <w:numId w:val="3"/>
+        </w:numPr>
+      </w:pPr>
+      <w:r>
+        <w:t xml:space="preserve">Common utilities </w:t>
+      </w:r>
+    </w:p>
+    <w:p>
+      <w:pPr>
+        <w:numPr>
+          <w:ilvl w:val="0"/>
+          <w:numId w:val="3"/>
+        </w:numPr>
+      </w:pPr>
+      <w:r>
+        <w:t xml:space="preserve">Configuration management </w:t>
+      </w:r>
+    </w:p>
+    <w:p>
+      <w:pPr>
+        <w:numPr>
+          <w:ilvl w:val="0"/>
+          <w:numId w:val="3"/>
+        </w:numPr>
+      </w:pPr>
+      <w:r>
+        <w:t xml:space="preserve">Plugin framework (eventually) </w:t>
+      </w:r>
+    </w:p>
+    <w:p>
+      <w:r>
+        <w:lastRenderedPageBreak/>
+        <w:t>Without these, every later phase ends up duplicating code.</w:t>
+      </w:r>
+    </w:p>
+    <w:p/>
+    <w:p>
+      <w:r>
+        <w:pict w14:anchorId="13D3C56C">
+          <v:rect id="_x0000_i1026" style="width:0;height:1.5pt" o:hralign="center" o:hrstd="t" o:hr="t" fillcolor="#a0a0a0" stroked="f"/>
+        </w:pict>
+      </w:r>
+    </w:p>
+    <w:p>
+      <w:pPr>
+        <w:pStyle w:val="Heading3"/>
+      </w:pPr>
+      <w:r>
         <w:t>Phase 1 – Relationship Engine (Foundation)</w:t>
+      </w:r>
+      <w:r>
+        <w:t xml:space="preserve"> – Discover Relationships</w:t>
       </w:r>
     </w:p>
     <w:p>
@@ -585,23 +859,19 @@
     <w:p>
       <w:r>
         <w:pict w14:anchorId="3E4974D6">
-          <v:rect id="_x0000_i1026" style="width:0;height:1.5pt" o:hralign="center" o:hrstd="t" o:hr="t" fillcolor="#a0a0a0" stroked="f"/>
+          <v:rect id="_x0000_i1027" style="width:0;height:1.5pt" o:hralign="center" o:hrstd="t" o:hr="t" fillcolor="#a0a0a0" stroked="f"/>
         </w:pict>
       </w:r>
     </w:p>
     <w:p>
       <w:pPr>
-        <w:rPr>
-          <w:b/>
-          <w:bCs/>
-        </w:rPr>
-      </w:pPr>
-      <w:r>
-        <w:rPr>
-          <w:b/>
-          <w:bCs/>
-        </w:rPr>
+        <w:pStyle w:val="Heading3"/>
+      </w:pPr>
+      <w:r>
         <w:t>Phase 2 – Example Visualization</w:t>
+      </w:r>
+      <w:r>
+        <w:t xml:space="preserve"> – Visualize Examples</w:t>
       </w:r>
     </w:p>
     <w:tbl>
@@ -819,23 +1089,19 @@
     <w:p>
       <w:r>
         <w:pict w14:anchorId="2313FCDA">
-          <v:rect id="_x0000_i1027" style="width:0;height:1.5pt" o:hralign="center" o:hrstd="t" o:hr="t" fillcolor="#a0a0a0" stroked="f"/>
+          <v:rect id="_x0000_i1028" style="width:0;height:1.5pt" o:hralign="center" o:hrstd="t" o:hr="t" fillcolor="#a0a0a0" stroked="f"/>
         </w:pict>
       </w:r>
     </w:p>
     <w:p>
       <w:pPr>
-        <w:rPr>
-          <w:b/>
-          <w:bCs/>
-        </w:rPr>
-      </w:pPr>
-      <w:r>
-        <w:rPr>
-          <w:b/>
-          <w:bCs/>
-        </w:rPr>
+        <w:pStyle w:val="Heading3"/>
+      </w:pPr>
+      <w:r>
         <w:t>Phase 3 – Profile Analysis</w:t>
+      </w:r>
+      <w:r>
+        <w:t xml:space="preserve"> – Understand Profiles</w:t>
       </w:r>
     </w:p>
     <w:tbl>
@@ -974,6 +1240,7 @@
           </w:tcPr>
           <w:p>
             <w:r>
+              <w:lastRenderedPageBreak/>
               <w:t>☐</w:t>
             </w:r>
           </w:p>
@@ -1003,7 +1270,6 @@
           </w:tcPr>
           <w:p>
             <w:r>
-              <w:lastRenderedPageBreak/>
               <w:t>☐</w:t>
             </w:r>
           </w:p>
@@ -1054,23 +1320,19 @@
     <w:p>
       <w:r>
         <w:pict w14:anchorId="50D7F922">
-          <v:rect id="_x0000_i1028" style="width:0;height:1.5pt" o:hralign="center" o:hrstd="t" o:hr="t" fillcolor="#a0a0a0" stroked="f"/>
+          <v:rect id="_x0000_i1029" style="width:0;height:1.5pt" o:hralign="center" o:hrstd="t" o:hr="t" fillcolor="#a0a0a0" stroked="f"/>
         </w:pict>
       </w:r>
     </w:p>
     <w:p>
       <w:pPr>
-        <w:rPr>
-          <w:b/>
-          <w:bCs/>
-        </w:rPr>
-      </w:pPr>
-      <w:r>
-        <w:rPr>
-          <w:b/>
-          <w:bCs/>
-        </w:rPr>
+        <w:pStyle w:val="Heading3"/>
+      </w:pPr>
+      <w:r>
         <w:t>Phase 4 – Terminology Analysis</w:t>
+      </w:r>
+      <w:r>
+        <w:t xml:space="preserve"> – Understanding Terminology</w:t>
       </w:r>
     </w:p>
     <w:tbl>
@@ -1269,23 +1531,19 @@
     <w:p>
       <w:r>
         <w:pict w14:anchorId="087D6133">
-          <v:rect id="_x0000_i1029" style="width:0;height:1.5pt" o:hralign="center" o:hrstd="t" o:hr="t" fillcolor="#a0a0a0" stroked="f"/>
+          <v:rect id="_x0000_i1030" style="width:0;height:1.5pt" o:hralign="center" o:hrstd="t" o:hr="t" fillcolor="#a0a0a0" stroked="f"/>
         </w:pict>
       </w:r>
     </w:p>
     <w:p>
       <w:pPr>
-        <w:rPr>
-          <w:b/>
-          <w:bCs/>
-        </w:rPr>
-      </w:pPr>
-      <w:r>
-        <w:rPr>
-          <w:b/>
-          <w:bCs/>
-        </w:rPr>
+        <w:pStyle w:val="Heading3"/>
+      </w:pPr>
+      <w:r>
         <w:t>Phase 5 – IG Dependency Analysis</w:t>
+      </w:r>
+      <w:r>
+        <w:t xml:space="preserve"> – Understanding Dependencies</w:t>
       </w:r>
     </w:p>
     <w:tbl>
@@ -1503,23 +1761,19 @@
     <w:p>
       <w:r>
         <w:pict w14:anchorId="4D069ED1">
-          <v:rect id="_x0000_i1030" style="width:0;height:1.5pt" o:hralign="center" o:hrstd="t" o:hr="t" fillcolor="#a0a0a0" stroked="f"/>
+          <v:rect id="_x0000_i1031" style="width:0;height:1.5pt" o:hralign="center" o:hrstd="t" o:hr="t" fillcolor="#a0a0a0" stroked="f"/>
         </w:pict>
       </w:r>
     </w:p>
     <w:p>
       <w:pPr>
-        <w:rPr>
-          <w:b/>
-          <w:bCs/>
-        </w:rPr>
-      </w:pPr>
-      <w:r>
-        <w:rPr>
-          <w:b/>
-          <w:bCs/>
-        </w:rPr>
+        <w:pStyle w:val="Heading3"/>
+      </w:pPr>
+      <w:r>
         <w:t>Phase 6 – Documentation Generation</w:t>
+      </w:r>
+      <w:r>
+        <w:t xml:space="preserve"> – Generate Documentation</w:t>
       </w:r>
     </w:p>
     <w:tbl>
@@ -1634,6 +1888,7 @@
           </w:tcPr>
           <w:p>
             <w:r>
+              <w:lastRenderedPageBreak/>
               <w:t>☐</w:t>
             </w:r>
           </w:p>
@@ -1663,7 +1918,6 @@
           </w:tcPr>
           <w:p>
             <w:r>
-              <w:lastRenderedPageBreak/>
               <w:t>☐</w:t>
             </w:r>
           </w:p>
@@ -1743,23 +1997,19 @@
     <w:p>
       <w:r>
         <w:pict w14:anchorId="1207A819">
-          <v:rect id="_x0000_i1031" style="width:0;height:1.5pt" o:hralign="center" o:hrstd="t" o:hr="t" fillcolor="#a0a0a0" stroked="f"/>
+          <v:rect id="_x0000_i1032" style="width:0;height:1.5pt" o:hralign="center" o:hrstd="t" o:hr="t" fillcolor="#a0a0a0" stroked="f"/>
         </w:pict>
       </w:r>
     </w:p>
     <w:p>
       <w:pPr>
-        <w:rPr>
-          <w:b/>
-          <w:bCs/>
-        </w:rPr>
-      </w:pPr>
-      <w:r>
-        <w:rPr>
-          <w:b/>
-          <w:bCs/>
-        </w:rPr>
+        <w:pStyle w:val="Heading3"/>
+      </w:pPr>
+      <w:r>
         <w:t>Phase 7 – Authoring Assistance</w:t>
+      </w:r>
+      <w:r>
+        <w:t xml:space="preserve"> – Assist the Author</w:t>
       </w:r>
     </w:p>
     <w:tbl>
@@ -1976,9 +2226,17 @@
     </w:tbl>
     <w:p>
       <w:r>
-        <w:pict w14:anchorId="4AC87756">
-          <v:rect id="_x0000_i1032" style="width:0;height:1.5pt" o:hralign="center" o:hrstd="t" o:hr="t" fillcolor="#a0a0a0" stroked="f"/>
+        <w:pict w14:anchorId="026529C7">
+          <v:rect id="_x0000_i1033" style="width:0;height:1.5pt" o:hralign="center" o:hrstd="t" o:hr="t" fillcolor="#a0a0a0" stroked="f"/>
         </w:pict>
+      </w:r>
+    </w:p>
+    <w:p>
+      <w:pPr>
+        <w:pStyle w:val="Heading3"/>
+      </w:pPr>
+      <w:r>
+        <w:t>Future Capability Domains</w:t>
       </w:r>
     </w:p>
     <w:p>
@@ -1993,20 +2251,259 @@
           <w:b/>
           <w:bCs/>
         </w:rPr>
+        <w:t>Potential future expansions once the core toolkit is mature:</w:t>
+      </w:r>
+    </w:p>
+    <w:p>
+      <w:pPr>
+        <w:numPr>
+          <w:ilvl w:val="0"/>
+          <w:numId w:val="6"/>
+        </w:numPr>
+        <w:rPr>
+          <w:b/>
+          <w:bCs/>
+        </w:rPr>
+      </w:pPr>
+      <w:r>
+        <w:rPr>
+          <w:b/>
+          <w:bCs/>
+        </w:rPr>
+        <w:t xml:space="preserve">Cross-IG Ecosystem Analysis </w:t>
+      </w:r>
+    </w:p>
+    <w:p>
+      <w:pPr>
+        <w:numPr>
+          <w:ilvl w:val="0"/>
+          <w:numId w:val="6"/>
+        </w:numPr>
+        <w:rPr>
+          <w:b/>
+          <w:bCs/>
+        </w:rPr>
+      </w:pPr>
+      <w:r>
+        <w:rPr>
+          <w:b/>
+          <w:bCs/>
+        </w:rPr>
+        <w:t xml:space="preserve">Workflow Architecture Modeling </w:t>
+      </w:r>
+    </w:p>
+    <w:p>
+      <w:pPr>
+        <w:numPr>
+          <w:ilvl w:val="0"/>
+          <w:numId w:val="6"/>
+        </w:numPr>
+        <w:rPr>
+          <w:b/>
+          <w:bCs/>
+        </w:rPr>
+      </w:pPr>
+      <w:r>
+        <w:rPr>
+          <w:b/>
+          <w:bCs/>
+        </w:rPr>
+        <w:t xml:space="preserve">Business Concept Mapping </w:t>
+      </w:r>
+    </w:p>
+    <w:p>
+      <w:pPr>
+        <w:numPr>
+          <w:ilvl w:val="0"/>
+          <w:numId w:val="6"/>
+        </w:numPr>
+        <w:rPr>
+          <w:b/>
+          <w:bCs/>
+        </w:rPr>
+      </w:pPr>
+      <w:r>
+        <w:rPr>
+          <w:b/>
+          <w:bCs/>
+        </w:rPr>
+        <w:t xml:space="preserve">Cross-IG Dependency Analysis </w:t>
+      </w:r>
+    </w:p>
+    <w:p>
+      <w:pPr>
+        <w:numPr>
+          <w:ilvl w:val="0"/>
+          <w:numId w:val="6"/>
+        </w:numPr>
+        <w:rPr>
+          <w:b/>
+          <w:bCs/>
+        </w:rPr>
+      </w:pPr>
+      <w:r>
+        <w:rPr>
+          <w:b/>
+          <w:bCs/>
+        </w:rPr>
+        <w:t xml:space="preserve">Multi-IG Validation </w:t>
+      </w:r>
+    </w:p>
+    <w:p>
+      <w:pPr>
+        <w:numPr>
+          <w:ilvl w:val="0"/>
+          <w:numId w:val="6"/>
+        </w:numPr>
+        <w:rPr>
+          <w:b/>
+          <w:bCs/>
+        </w:rPr>
+      </w:pPr>
+      <w:r>
+        <w:rPr>
+          <w:b/>
+          <w:bCs/>
+        </w:rPr>
+        <w:t>Implementation Landscape Visualization</w:t>
+      </w:r>
+    </w:p>
+    <w:p>
+      <w:r>
+        <w:t>Possible capabilities:</w:t>
+      </w:r>
+    </w:p>
+    <w:p>
+      <w:pPr>
+        <w:numPr>
+          <w:ilvl w:val="0"/>
+          <w:numId w:val="5"/>
+        </w:numPr>
+      </w:pPr>
+      <w:r>
+        <w:t xml:space="preserve">Cross-IG dependency analysis </w:t>
+      </w:r>
+    </w:p>
+    <w:p>
+      <w:pPr>
+        <w:numPr>
+          <w:ilvl w:val="0"/>
+          <w:numId w:val="5"/>
+        </w:numPr>
+      </w:pPr>
+      <w:r>
+        <w:t xml:space="preserve">Cross-IG workflow visualization </w:t>
+      </w:r>
+    </w:p>
+    <w:p>
+      <w:pPr>
+        <w:numPr>
+          <w:ilvl w:val="0"/>
+          <w:numId w:val="5"/>
+        </w:numPr>
+      </w:pPr>
+      <w:r>
+        <w:lastRenderedPageBreak/>
+        <w:t xml:space="preserve">Business concept mapping </w:t>
+      </w:r>
+    </w:p>
+    <w:p>
+      <w:pPr>
+        <w:numPr>
+          <w:ilvl w:val="0"/>
+          <w:numId w:val="5"/>
+        </w:numPr>
+      </w:pPr>
+      <w:r>
+        <w:t xml:space="preserve">Resource lifecycle mapping </w:t>
+      </w:r>
+    </w:p>
+    <w:p>
+      <w:pPr>
+        <w:numPr>
+          <w:ilvl w:val="0"/>
+          <w:numId w:val="5"/>
+        </w:numPr>
+      </w:pPr>
+      <w:r>
+        <w:t xml:space="preserve">Canonical/profile overlap detection </w:t>
+      </w:r>
+    </w:p>
+    <w:p>
+      <w:pPr>
+        <w:numPr>
+          <w:ilvl w:val="0"/>
+          <w:numId w:val="5"/>
+        </w:numPr>
+      </w:pPr>
+      <w:r>
+        <w:t xml:space="preserve">Shared terminology analysis </w:t>
+      </w:r>
+    </w:p>
+    <w:p>
+      <w:pPr>
+        <w:numPr>
+          <w:ilvl w:val="0"/>
+          <w:numId w:val="5"/>
+        </w:numPr>
+      </w:pPr>
+      <w:r>
+        <w:t xml:space="preserve">Touch-point identification </w:t>
+      </w:r>
+    </w:p>
+    <w:p>
+      <w:pPr>
+        <w:numPr>
+          <w:ilvl w:val="0"/>
+          <w:numId w:val="5"/>
+        </w:numPr>
+      </w:pPr>
+      <w:r>
+        <w:t xml:space="preserve">Ecosystem architecture diagrams </w:t>
+      </w:r>
+    </w:p>
+    <w:p>
+      <w:pPr>
+        <w:numPr>
+          <w:ilvl w:val="0"/>
+          <w:numId w:val="5"/>
+        </w:numPr>
+      </w:pPr>
+      <w:r>
+        <w:t xml:space="preserve">Version compatibility analysis </w:t>
+      </w:r>
+    </w:p>
+    <w:p>
+      <w:pPr>
+        <w:numPr>
+          <w:ilvl w:val="0"/>
+          <w:numId w:val="5"/>
+        </w:numPr>
+      </w:pPr>
+      <w:r>
+        <w:t>IG overlap and gap analysis</w:t>
+      </w:r>
+    </w:p>
+    <w:p/>
+    <w:p/>
+    <w:p>
+      <w:r>
+        <w:pict w14:anchorId="4AC87756">
+          <v:rect id="_x0000_i1034" style="width:0;height:1.5pt" o:hralign="center" o:hrstd="t" o:hr="t" fillcolor="#a0a0a0" stroked="f"/>
+        </w:pict>
+      </w:r>
+    </w:p>
+    <w:p>
+      <w:pPr>
+        <w:pStyle w:val="Heading2"/>
+      </w:pPr>
+      <w:r>
         <w:t>What we've already discussed</w:t>
       </w:r>
     </w:p>
     <w:p>
       <w:r>
-        <w:t xml:space="preserve">From our previous conversations, I'd </w:t>
-      </w:r>
-      <w:proofErr w:type="gramStart"/>
-      <w:r>
-        <w:t>actually mark</w:t>
-      </w:r>
-      <w:proofErr w:type="gramEnd"/>
-      <w:r>
-        <w:t xml:space="preserve"> several items as already explored or partially complete:</w:t>
+        <w:t>From our previous conversations, I'd actually mark several items as already explored or partially complete:</w:t>
       </w:r>
     </w:p>
     <w:tbl>
@@ -2101,13 +2598,8 @@
             <w:hideMark/>
           </w:tcPr>
           <w:p>
-            <w:proofErr w:type="gramStart"/>
-            <w:r>
-              <w:t>Validation</w:t>
-            </w:r>
-            <w:proofErr w:type="gramEnd"/>
-            <w:r>
-              <w:t xml:space="preserve"> profile generation and optimization</w:t>
+            <w:r>
+              <w:t>Validation profile generation and optimization</w:t>
             </w:r>
           </w:p>
         </w:tc>
@@ -2203,12 +2695,10 @@
           </w:tcPr>
           <w:p>
             <w:proofErr w:type="spellStart"/>
-            <w:proofErr w:type="gramStart"/>
             <w:r>
               <w:t>CodeSystem</w:t>
             </w:r>
             <w:proofErr w:type="spellEnd"/>
-            <w:proofErr w:type="gramEnd"/>
             <w:r>
               <w:t xml:space="preserve"> generation utilities</w:t>
             </w:r>
@@ -2281,20 +2771,14 @@
       </w:tr>
     </w:tbl>
     <w:p>
-      <w:proofErr w:type="gramStart"/>
-      <w:r>
-        <w:t>So</w:t>
-      </w:r>
-      <w:proofErr w:type="gramEnd"/>
-      <w:r>
-        <w:t xml:space="preserve"> we're not starting from scratch—we've already laid some of the groundwork.</w:t>
-      </w:r>
-    </w:p>
-    <w:p>
-      <w:r>
-        <w:lastRenderedPageBreak/>
+      <w:r>
+        <w:t>So we're not starting from scratch—we've already laid some of the groundwork.</w:t>
+      </w:r>
+    </w:p>
+    <w:p>
+      <w:r>
         <w:pict w14:anchorId="0796F730">
-          <v:rect id="_x0000_i1033" style="width:0;height:1.5pt" o:hralign="center" o:hrstd="t" o:hr="t" fillcolor="#a0a0a0" stroked="f"/>
+          <v:rect id="_x0000_i1035" style="width:0;height:1.5pt" o:hralign="center" o:hrstd="t" o:hr="t" fillcolor="#a0a0a0" stroked="f"/>
         </w:pict>
       </w:r>
     </w:p>
@@ -2315,6 +2799,7 @@
     </w:p>
     <w:p>
       <w:r>
+        <w:lastRenderedPageBreak/>
         <w:t>As we work, we'll undoubtedly think of additional ideas. Rather than interrupting the current effort, we can capture them in a backlog.</w:t>
       </w:r>
     </w:p>
@@ -2446,7 +2931,7 @@
     <w:p>
       <w:r>
         <w:pict w14:anchorId="459590DA">
-          <v:rect id="_x0000_i1034" style="width:0;height:1.5pt" o:hralign="center" o:hrstd="t" o:hr="t" fillcolor="#a0a0a0" stroked="f"/>
+          <v:rect id="_x0000_i1036" style="width:0;height:1.5pt" o:hralign="center" o:hrstd="t" o:hr="t" fillcolor="#a0a0a0" stroked="f"/>
         </w:pict>
       </w:r>
     </w:p>
@@ -2577,24 +3062,16 @@
           <w:b/>
           <w:bCs/>
         </w:rPr>
+        <w:t>Maintain</w:t>
+      </w:r>
+      <w:r>
+        <w:t xml:space="preserve"> – analyze impacts, identify dead references, and compare versions. </w:t>
+      </w:r>
+    </w:p>
+    <w:p>
+      <w:r>
         <w:lastRenderedPageBreak/>
-        <w:t>Maintain</w:t>
-      </w:r>
-      <w:r>
-        <w:t xml:space="preserve"> – analyze impacts, identify dead references, and compare versions. </w:t>
-      </w:r>
-    </w:p>
-    <w:p>
-      <w:r>
-        <w:t xml:space="preserve">One thing I would add to our roadmap is to assign each capability a priority (High/Medium/Low) and </w:t>
-      </w:r>
-      <w:proofErr w:type="gramStart"/>
-      <w:r>
-        <w:t>a maturity</w:t>
-      </w:r>
-      <w:proofErr w:type="gramEnd"/>
-      <w:r>
-        <w:t xml:space="preserve"> (Idea, Design, Prototype, Implemented). That gives us a lightweight project board we can revisit in future conversations.</w:t>
+        <w:t>One thing I would add to our roadmap is to assign each capability a priority (High/Medium/Low) and a maturity (Idea, Design, Prototype, Implemented). That gives us a lightweight project board we can revisit in future conversations.</w:t>
       </w:r>
     </w:p>
     <w:p>
@@ -2636,6 +3113,155 @@
 <file path=word/numbering.xml><?xml version="1.0" encoding="utf-8"?>
 <w:numbering xmlns:wpc="http://schemas.microsoft.com/office/word/2010/wordprocessingCanvas" xmlns:cx="http://schemas.microsoft.com/office/drawing/2014/chartex" xmlns:cx1="http://schemas.microsoft.com/office/drawing/2015/9/8/chartex" xmlns:cx2="http://schemas.microsoft.com/office/drawing/2015/10/21/chartex" xmlns:cx3="http://schemas.microsoft.com/office/drawing/2016/5/9/chartex" xmlns:cx4="http://schemas.microsoft.com/office/drawing/2016/5/10/chartex" xmlns:cx5="http://schemas.microsoft.com/office/drawing/2016/5/11/chartex" xmlns:cx6="http://schemas.microsoft.com/office/drawing/2016/5/12/chartex" xmlns:cx7="http://schemas.microsoft.com/office/drawing/2016/5/13/chartex" xmlns:cx8="http://schemas.microsoft.com/office/drawing/2016/5/14/chartex" xmlns:mc="http://schemas.openxmlformats.org/markup-compatibility/2006" xmlns:aink="http://schemas.microsoft.com/office/drawing/2016/ink" xmlns:am3d="http://schemas.microsoft.com/office/drawing/2017/model3d" xmlns:o="urn:schemas-microsoft-com:office:office" xmlns:oel="http://schemas.microsoft.com/office/2019/extlst" xmlns:r="http://schemas.openxmlformats.org/officeDocument/2006/relationships" xmlns:m="http://schemas.openxmlformats.org/officeDocument/2006/math" xmlns:v="urn:schemas-microsoft-com:vml" xmlns:wp14="http://schemas.microsoft.com/office/word/2010/wordprocessingDrawing" xmlns:wp="http://schemas.openxmlformats.org/drawingml/2006/wordprocessingDrawing" xmlns:w10="urn:schemas-microsoft-com:office:word" xmlns:w="http://schemas.openxmlformats.org/wordprocessingml/2006/main" xmlns:w14="http://schemas.microsoft.com/office/word/2010/wordml" xmlns:w15="http://schemas.microsoft.com/office/word/2012/wordml" xmlns:w16cex="http://schemas.microsoft.com/office/word/2018/wordml/cex" xmlns:w16cid="http://schemas.microsoft.com/office/word/2016/wordml/cid" xmlns:w16="http://schemas.microsoft.com/office/word/2018/wordml" xmlns:w16du="http://schemas.microsoft.com/office/word/2023/wordml/word16du" xmlns:w16sdtdh="http://schemas.microsoft.com/office/word/2020/wordml/sdtdatahash" xmlns:w16sdtfl="http://schemas.microsoft.com/office/word/2024/wordml/sdtformatlock" xmlns:w16se="http://schemas.microsoft.com/office/word/2015/wordml/symex" xmlns:wpg="http://schemas.microsoft.com/office/word/2010/wordprocessingGroup" xmlns:wpi="http://schemas.microsoft.com/office/word/2010/wordprocessingInk" xmlns:wne="http://schemas.microsoft.com/office/word/2006/wordml" xmlns:wps="http://schemas.microsoft.com/office/word/2010/wordprocessingShape" mc:Ignorable="w14 w15 w16se w16cid w16 w16cex w16sdtdh w16sdtfl w16du wp14">
   <w:abstractNum w:abstractNumId="0" w15:restartNumberingAfterBreak="0">
+    <w:nsid w:val="0F62430E"/>
+    <w:multiLevelType w:val="multilevel"/>
+    <w:tmpl w:val="7CFE9F22"/>
+    <w:lvl w:ilvl="0">
+      <w:start w:val="1"/>
+      <w:numFmt w:val="bullet"/>
+      <w:lvlText w:val=""/>
+      <w:lvlJc w:val="left"/>
+      <w:pPr>
+        <w:tabs>
+          <w:tab w:val="num" w:pos="720"/>
+        </w:tabs>
+        <w:ind w:left="720" w:hanging="360"/>
+      </w:pPr>
+      <w:rPr>
+        <w:rFonts w:ascii="Symbol" w:hAnsi="Symbol" w:hint="default"/>
+        <w:sz w:val="20"/>
+      </w:rPr>
+    </w:lvl>
+    <w:lvl w:ilvl="1" w:tentative="1">
+      <w:start w:val="1"/>
+      <w:numFmt w:val="bullet"/>
+      <w:lvlText w:val="o"/>
+      <w:lvlJc w:val="left"/>
+      <w:pPr>
+        <w:tabs>
+          <w:tab w:val="num" w:pos="1440"/>
+        </w:tabs>
+        <w:ind w:left="1440" w:hanging="360"/>
+      </w:pPr>
+      <w:rPr>
+        <w:rFonts w:ascii="Courier New" w:hAnsi="Courier New" w:hint="default"/>
+        <w:sz w:val="20"/>
+      </w:rPr>
+    </w:lvl>
+    <w:lvl w:ilvl="2" w:tentative="1">
+      <w:start w:val="1"/>
+      <w:numFmt w:val="bullet"/>
+      <w:lvlText w:val=""/>
+      <w:lvlJc w:val="left"/>
+      <w:pPr>
+        <w:tabs>
+          <w:tab w:val="num" w:pos="2160"/>
+        </w:tabs>
+        <w:ind w:left="2160" w:hanging="360"/>
+      </w:pPr>
+      <w:rPr>
+        <w:rFonts w:ascii="Wingdings" w:hAnsi="Wingdings" w:hint="default"/>
+        <w:sz w:val="20"/>
+      </w:rPr>
+    </w:lvl>
+    <w:lvl w:ilvl="3" w:tentative="1">
+      <w:start w:val="1"/>
+      <w:numFmt w:val="bullet"/>
+      <w:lvlText w:val=""/>
+      <w:lvlJc w:val="left"/>
+      <w:pPr>
+        <w:tabs>
+          <w:tab w:val="num" w:pos="2880"/>
+        </w:tabs>
+        <w:ind w:left="2880" w:hanging="360"/>
+      </w:pPr>
+      <w:rPr>
+        <w:rFonts w:ascii="Wingdings" w:hAnsi="Wingdings" w:hint="default"/>
+        <w:sz w:val="20"/>
+      </w:rPr>
+    </w:lvl>
+    <w:lvl w:ilvl="4" w:tentative="1">
+      <w:start w:val="1"/>
+      <w:numFmt w:val="bullet"/>
+      <w:lvlText w:val=""/>
+      <w:lvlJc w:val="left"/>
+      <w:pPr>
+        <w:tabs>
+          <w:tab w:val="num" w:pos="3600"/>
+        </w:tabs>
+        <w:ind w:left="3600" w:hanging="360"/>
+      </w:pPr>
+      <w:rPr>
+        <w:rFonts w:ascii="Wingdings" w:hAnsi="Wingdings" w:hint="default"/>
+        <w:sz w:val="20"/>
+      </w:rPr>
+    </w:lvl>
+    <w:lvl w:ilvl="5" w:tentative="1">
+      <w:start w:val="1"/>
+      <w:numFmt w:val="bullet"/>
+      <w:lvlText w:val=""/>
+      <w:lvlJc w:val="left"/>
+      <w:pPr>
+        <w:tabs>
+          <w:tab w:val="num" w:pos="4320"/>
+        </w:tabs>
+        <w:ind w:left="4320" w:hanging="360"/>
+      </w:pPr>
+      <w:rPr>
+        <w:rFonts w:ascii="Wingdings" w:hAnsi="Wingdings" w:hint="default"/>
+        <w:sz w:val="20"/>
+      </w:rPr>
+    </w:lvl>
+    <w:lvl w:ilvl="6" w:tentative="1">
+      <w:start w:val="1"/>
+      <w:numFmt w:val="bullet"/>
+      <w:lvlText w:val=""/>
+      <w:lvlJc w:val="left"/>
+      <w:pPr>
+        <w:tabs>
+          <w:tab w:val="num" w:pos="5040"/>
+        </w:tabs>
+        <w:ind w:left="5040" w:hanging="360"/>
+      </w:pPr>
+      <w:rPr>
+        <w:rFonts w:ascii="Wingdings" w:hAnsi="Wingdings" w:hint="default"/>
+        <w:sz w:val="20"/>
+      </w:rPr>
+    </w:lvl>
+    <w:lvl w:ilvl="7" w:tentative="1">
+      <w:start w:val="1"/>
+      <w:numFmt w:val="bullet"/>
+      <w:lvlText w:val=""/>
+      <w:lvlJc w:val="left"/>
+      <w:pPr>
+        <w:tabs>
+          <w:tab w:val="num" w:pos="5760"/>
+        </w:tabs>
+        <w:ind w:left="5760" w:hanging="360"/>
+      </w:pPr>
+      <w:rPr>
+        <w:rFonts w:ascii="Wingdings" w:hAnsi="Wingdings" w:hint="default"/>
+        <w:sz w:val="20"/>
+      </w:rPr>
+    </w:lvl>
+    <w:lvl w:ilvl="8" w:tentative="1">
+      <w:start w:val="1"/>
+      <w:numFmt w:val="bullet"/>
+      <w:lvlText w:val=""/>
+      <w:lvlJc w:val="left"/>
+      <w:pPr>
+        <w:tabs>
+          <w:tab w:val="num" w:pos="6480"/>
+        </w:tabs>
+        <w:ind w:left="6480" w:hanging="360"/>
+      </w:pPr>
+      <w:rPr>
+        <w:rFonts w:ascii="Wingdings" w:hAnsi="Wingdings" w:hint="default"/>
+        <w:sz w:val="20"/>
+      </w:rPr>
+    </w:lvl>
+  </w:abstractNum>
+  <w:abstractNum w:abstractNumId="1" w15:restartNumberingAfterBreak="0">
     <w:nsid w:val="25BA781F"/>
     <w:multiLevelType w:val="multilevel"/>
     <w:tmpl w:val="FBEC47DA"/>
@@ -2784,7 +3410,7 @@
       </w:rPr>
     </w:lvl>
   </w:abstractNum>
-  <w:abstractNum w:abstractNumId="1" w15:restartNumberingAfterBreak="0">
+  <w:abstractNum w:abstractNumId="2" w15:restartNumberingAfterBreak="0">
     <w:nsid w:val="2E193314"/>
     <w:multiLevelType w:val="multilevel"/>
     <w:tmpl w:val="6712ACF0"/>
@@ -2933,7 +3559,156 @@
       </w:rPr>
     </w:lvl>
   </w:abstractNum>
-  <w:abstractNum w:abstractNumId="2" w15:restartNumberingAfterBreak="0">
+  <w:abstractNum w:abstractNumId="3" w15:restartNumberingAfterBreak="0">
+    <w:nsid w:val="3E3C53FC"/>
+    <w:multiLevelType w:val="multilevel"/>
+    <w:tmpl w:val="5D341AD4"/>
+    <w:lvl w:ilvl="0">
+      <w:start w:val="1"/>
+      <w:numFmt w:val="bullet"/>
+      <w:lvlText w:val=""/>
+      <w:lvlJc w:val="left"/>
+      <w:pPr>
+        <w:tabs>
+          <w:tab w:val="num" w:pos="720"/>
+        </w:tabs>
+        <w:ind w:left="720" w:hanging="360"/>
+      </w:pPr>
+      <w:rPr>
+        <w:rFonts w:ascii="Symbol" w:hAnsi="Symbol" w:hint="default"/>
+        <w:sz w:val="20"/>
+      </w:rPr>
+    </w:lvl>
+    <w:lvl w:ilvl="1" w:tentative="1">
+      <w:start w:val="1"/>
+      <w:numFmt w:val="bullet"/>
+      <w:lvlText w:val="o"/>
+      <w:lvlJc w:val="left"/>
+      <w:pPr>
+        <w:tabs>
+          <w:tab w:val="num" w:pos="1440"/>
+        </w:tabs>
+        <w:ind w:left="1440" w:hanging="360"/>
+      </w:pPr>
+      <w:rPr>
+        <w:rFonts w:ascii="Courier New" w:hAnsi="Courier New" w:hint="default"/>
+        <w:sz w:val="20"/>
+      </w:rPr>
+    </w:lvl>
+    <w:lvl w:ilvl="2" w:tentative="1">
+      <w:start w:val="1"/>
+      <w:numFmt w:val="bullet"/>
+      <w:lvlText w:val=""/>
+      <w:lvlJc w:val="left"/>
+      <w:pPr>
+        <w:tabs>
+          <w:tab w:val="num" w:pos="2160"/>
+        </w:tabs>
+        <w:ind w:left="2160" w:hanging="360"/>
+      </w:pPr>
+      <w:rPr>
+        <w:rFonts w:ascii="Wingdings" w:hAnsi="Wingdings" w:hint="default"/>
+        <w:sz w:val="20"/>
+      </w:rPr>
+    </w:lvl>
+    <w:lvl w:ilvl="3" w:tentative="1">
+      <w:start w:val="1"/>
+      <w:numFmt w:val="bullet"/>
+      <w:lvlText w:val=""/>
+      <w:lvlJc w:val="left"/>
+      <w:pPr>
+        <w:tabs>
+          <w:tab w:val="num" w:pos="2880"/>
+        </w:tabs>
+        <w:ind w:left="2880" w:hanging="360"/>
+      </w:pPr>
+      <w:rPr>
+        <w:rFonts w:ascii="Wingdings" w:hAnsi="Wingdings" w:hint="default"/>
+        <w:sz w:val="20"/>
+      </w:rPr>
+    </w:lvl>
+    <w:lvl w:ilvl="4" w:tentative="1">
+      <w:start w:val="1"/>
+      <w:numFmt w:val="bullet"/>
+      <w:lvlText w:val=""/>
+      <w:lvlJc w:val="left"/>
+      <w:pPr>
+        <w:tabs>
+          <w:tab w:val="num" w:pos="3600"/>
+        </w:tabs>
+        <w:ind w:left="3600" w:hanging="360"/>
+      </w:pPr>
+      <w:rPr>
+        <w:rFonts w:ascii="Wingdings" w:hAnsi="Wingdings" w:hint="default"/>
+        <w:sz w:val="20"/>
+      </w:rPr>
+    </w:lvl>
+    <w:lvl w:ilvl="5" w:tentative="1">
+      <w:start w:val="1"/>
+      <w:numFmt w:val="bullet"/>
+      <w:lvlText w:val=""/>
+      <w:lvlJc w:val="left"/>
+      <w:pPr>
+        <w:tabs>
+          <w:tab w:val="num" w:pos="4320"/>
+        </w:tabs>
+        <w:ind w:left="4320" w:hanging="360"/>
+      </w:pPr>
+      <w:rPr>
+        <w:rFonts w:ascii="Wingdings" w:hAnsi="Wingdings" w:hint="default"/>
+        <w:sz w:val="20"/>
+      </w:rPr>
+    </w:lvl>
+    <w:lvl w:ilvl="6" w:tentative="1">
+      <w:start w:val="1"/>
+      <w:numFmt w:val="bullet"/>
+      <w:lvlText w:val=""/>
+      <w:lvlJc w:val="left"/>
+      <w:pPr>
+        <w:tabs>
+          <w:tab w:val="num" w:pos="5040"/>
+        </w:tabs>
+        <w:ind w:left="5040" w:hanging="360"/>
+      </w:pPr>
+      <w:rPr>
+        <w:rFonts w:ascii="Wingdings" w:hAnsi="Wingdings" w:hint="default"/>
+        <w:sz w:val="20"/>
+      </w:rPr>
+    </w:lvl>
+    <w:lvl w:ilvl="7" w:tentative="1">
+      <w:start w:val="1"/>
+      <w:numFmt w:val="bullet"/>
+      <w:lvlText w:val=""/>
+      <w:lvlJc w:val="left"/>
+      <w:pPr>
+        <w:tabs>
+          <w:tab w:val="num" w:pos="5760"/>
+        </w:tabs>
+        <w:ind w:left="5760" w:hanging="360"/>
+      </w:pPr>
+      <w:rPr>
+        <w:rFonts w:ascii="Wingdings" w:hAnsi="Wingdings" w:hint="default"/>
+        <w:sz w:val="20"/>
+      </w:rPr>
+    </w:lvl>
+    <w:lvl w:ilvl="8" w:tentative="1">
+      <w:start w:val="1"/>
+      <w:numFmt w:val="bullet"/>
+      <w:lvlText w:val=""/>
+      <w:lvlJc w:val="left"/>
+      <w:pPr>
+        <w:tabs>
+          <w:tab w:val="num" w:pos="6480"/>
+        </w:tabs>
+        <w:ind w:left="6480" w:hanging="360"/>
+      </w:pPr>
+      <w:rPr>
+        <w:rFonts w:ascii="Wingdings" w:hAnsi="Wingdings" w:hint="default"/>
+        <w:sz w:val="20"/>
+      </w:rPr>
+    </w:lvl>
+  </w:abstractNum>
+  <w:abstractNum w:abstractNumId="4" w15:restartNumberingAfterBreak="0">
     <w:nsid w:val="69A6502E"/>
     <w:multiLevelType w:val="multilevel"/>
     <w:tmpl w:val="60168776"/>
@@ -3082,14 +3857,172 @@
       </w:rPr>
     </w:lvl>
   </w:abstractNum>
+  <w:abstractNum w:abstractNumId="5" w15:restartNumberingAfterBreak="0">
+    <w:nsid w:val="7E195F08"/>
+    <w:multiLevelType w:val="multilevel"/>
+    <w:tmpl w:val="03EE356C"/>
+    <w:lvl w:ilvl="0">
+      <w:start w:val="1"/>
+      <w:numFmt w:val="bullet"/>
+      <w:lvlText w:val=""/>
+      <w:lvlJc w:val="left"/>
+      <w:pPr>
+        <w:tabs>
+          <w:tab w:val="num" w:pos="720"/>
+        </w:tabs>
+        <w:ind w:left="720" w:hanging="360"/>
+      </w:pPr>
+      <w:rPr>
+        <w:rFonts w:ascii="Symbol" w:hAnsi="Symbol" w:hint="default"/>
+        <w:sz w:val="20"/>
+      </w:rPr>
+    </w:lvl>
+    <w:lvl w:ilvl="1" w:tentative="1">
+      <w:start w:val="1"/>
+      <w:numFmt w:val="bullet"/>
+      <w:lvlText w:val="o"/>
+      <w:lvlJc w:val="left"/>
+      <w:pPr>
+        <w:tabs>
+          <w:tab w:val="num" w:pos="1440"/>
+        </w:tabs>
+        <w:ind w:left="1440" w:hanging="360"/>
+      </w:pPr>
+      <w:rPr>
+        <w:rFonts w:ascii="Courier New" w:hAnsi="Courier New" w:hint="default"/>
+        <w:sz w:val="20"/>
+      </w:rPr>
+    </w:lvl>
+    <w:lvl w:ilvl="2" w:tentative="1">
+      <w:start w:val="1"/>
+      <w:numFmt w:val="bullet"/>
+      <w:lvlText w:val=""/>
+      <w:lvlJc w:val="left"/>
+      <w:pPr>
+        <w:tabs>
+          <w:tab w:val="num" w:pos="2160"/>
+        </w:tabs>
+        <w:ind w:left="2160" w:hanging="360"/>
+      </w:pPr>
+      <w:rPr>
+        <w:rFonts w:ascii="Wingdings" w:hAnsi="Wingdings" w:hint="default"/>
+        <w:sz w:val="20"/>
+      </w:rPr>
+    </w:lvl>
+    <w:lvl w:ilvl="3" w:tentative="1">
+      <w:start w:val="1"/>
+      <w:numFmt w:val="bullet"/>
+      <w:lvlText w:val=""/>
+      <w:lvlJc w:val="left"/>
+      <w:pPr>
+        <w:tabs>
+          <w:tab w:val="num" w:pos="2880"/>
+        </w:tabs>
+        <w:ind w:left="2880" w:hanging="360"/>
+      </w:pPr>
+      <w:rPr>
+        <w:rFonts w:ascii="Wingdings" w:hAnsi="Wingdings" w:hint="default"/>
+        <w:sz w:val="20"/>
+      </w:rPr>
+    </w:lvl>
+    <w:lvl w:ilvl="4" w:tentative="1">
+      <w:start w:val="1"/>
+      <w:numFmt w:val="bullet"/>
+      <w:lvlText w:val=""/>
+      <w:lvlJc w:val="left"/>
+      <w:pPr>
+        <w:tabs>
+          <w:tab w:val="num" w:pos="3600"/>
+        </w:tabs>
+        <w:ind w:left="3600" w:hanging="360"/>
+      </w:pPr>
+      <w:rPr>
+        <w:rFonts w:ascii="Wingdings" w:hAnsi="Wingdings" w:hint="default"/>
+        <w:sz w:val="20"/>
+      </w:rPr>
+    </w:lvl>
+    <w:lvl w:ilvl="5" w:tentative="1">
+      <w:start w:val="1"/>
+      <w:numFmt w:val="bullet"/>
+      <w:lvlText w:val=""/>
+      <w:lvlJc w:val="left"/>
+      <w:pPr>
+        <w:tabs>
+          <w:tab w:val="num" w:pos="4320"/>
+        </w:tabs>
+        <w:ind w:left="4320" w:hanging="360"/>
+      </w:pPr>
+      <w:rPr>
+        <w:rFonts w:ascii="Wingdings" w:hAnsi="Wingdings" w:hint="default"/>
+        <w:sz w:val="20"/>
+      </w:rPr>
+    </w:lvl>
+    <w:lvl w:ilvl="6" w:tentative="1">
+      <w:start w:val="1"/>
+      <w:numFmt w:val="bullet"/>
+      <w:lvlText w:val=""/>
+      <w:lvlJc w:val="left"/>
+      <w:pPr>
+        <w:tabs>
+          <w:tab w:val="num" w:pos="5040"/>
+        </w:tabs>
+        <w:ind w:left="5040" w:hanging="360"/>
+      </w:pPr>
+      <w:rPr>
+        <w:rFonts w:ascii="Wingdings" w:hAnsi="Wingdings" w:hint="default"/>
+        <w:sz w:val="20"/>
+      </w:rPr>
+    </w:lvl>
+    <w:lvl w:ilvl="7" w:tentative="1">
+      <w:start w:val="1"/>
+      <w:numFmt w:val="bullet"/>
+      <w:lvlText w:val=""/>
+      <w:lvlJc w:val="left"/>
+      <w:pPr>
+        <w:tabs>
+          <w:tab w:val="num" w:pos="5760"/>
+        </w:tabs>
+        <w:ind w:left="5760" w:hanging="360"/>
+      </w:pPr>
+      <w:rPr>
+        <w:rFonts w:ascii="Wingdings" w:hAnsi="Wingdings" w:hint="default"/>
+        <w:sz w:val="20"/>
+      </w:rPr>
+    </w:lvl>
+    <w:lvl w:ilvl="8" w:tentative="1">
+      <w:start w:val="1"/>
+      <w:numFmt w:val="bullet"/>
+      <w:lvlText w:val=""/>
+      <w:lvlJc w:val="left"/>
+      <w:pPr>
+        <w:tabs>
+          <w:tab w:val="num" w:pos="6480"/>
+        </w:tabs>
+        <w:ind w:left="6480" w:hanging="360"/>
+      </w:pPr>
+      <w:rPr>
+        <w:rFonts w:ascii="Wingdings" w:hAnsi="Wingdings" w:hint="default"/>
+        <w:sz w:val="20"/>
+      </w:rPr>
+    </w:lvl>
+  </w:abstractNum>
   <w:num w:numId="1" w16cid:durableId="7874171">
+    <w:abstractNumId w:val="1"/>
+  </w:num>
+  <w:num w:numId="2" w16cid:durableId="684021730">
+    <w:abstractNumId w:val="4"/>
+  </w:num>
+  <w:num w:numId="3" w16cid:durableId="1942562280">
+    <w:abstractNumId w:val="2"/>
+  </w:num>
+  <w:num w:numId="4" w16cid:durableId="1331373516">
+    <w:abstractNumId w:val="3"/>
+  </w:num>
+  <w:num w:numId="5" w16cid:durableId="709303211">
     <w:abstractNumId w:val="0"/>
   </w:num>
-  <w:num w:numId="2" w16cid:durableId="684021730">
-    <w:abstractNumId w:val="2"/>
-  </w:num>
-  <w:num w:numId="3" w16cid:durableId="1942562280">
-    <w:abstractNumId w:val="1"/>
+  <w:num w:numId="6" w16cid:durableId="1642424400">
+    <w:abstractNumId w:val="5"/>
   </w:num>
 </w:numbering>
 </file>
@@ -3523,7 +4456,6 @@
     <w:next w:val="Normal"/>
     <w:link w:val="Heading2Char"/>
     <w:uiPriority w:val="9"/>
-    <w:semiHidden/>
     <w:unhideWhenUsed/>
     <w:qFormat/>
     <w:rsid w:val="007F5266"/>
@@ -3546,7 +4478,6 @@
     <w:next w:val="Normal"/>
     <w:link w:val="Heading3Char"/>
     <w:uiPriority w:val="9"/>
-    <w:semiHidden/>
     <w:unhideWhenUsed/>
     <w:qFormat/>
     <w:rsid w:val="007F5266"/>
@@ -3698,6 +4629,7 @@
   <w:style w:type="character" w:default="1" w:styleId="DefaultParagraphFont">
     <w:name w:val="Default Paragraph Font"/>
     <w:uiPriority w:val="1"/>
+    <w:semiHidden/>
     <w:unhideWhenUsed/>
   </w:style>
   <w:style w:type="table" w:default="1" w:styleId="TableNormal">
@@ -3739,7 +4671,6 @@
     <w:basedOn w:val="DefaultParagraphFont"/>
     <w:link w:val="Heading2"/>
     <w:uiPriority w:val="9"/>
-    <w:semiHidden/>
     <w:rsid w:val="007F5266"/>
     <w:rPr>
       <w:rFonts w:asciiTheme="majorHAnsi" w:eastAsiaTheme="majorEastAsia" w:hAnsiTheme="majorHAnsi" w:cstheme="majorBidi"/>
@@ -3753,7 +4684,6 @@
     <w:basedOn w:val="DefaultParagraphFont"/>
     <w:link w:val="Heading3"/>
     <w:uiPriority w:val="9"/>
-    <w:semiHidden/>
     <w:rsid w:val="007F5266"/>
     <w:rPr>
       <w:rFonts w:eastAsiaTheme="majorEastAsia" w:cstheme="majorBidi"/>

</xml_diff>